<commit_message>
mtd complaint docx: the caption's party cell keeps its text 0.75 pt (15 twips) further from its rule, as LibreOffice sets cell text inside the border where typst draws the rule over the gap (found on the mtd motion brief's caption); the docx PDF pixel-identical on all 9 pages at 60 dpi, review hash updated; docx XENG-001..003 pass (196/196 lines), typst 9 and docx 13 checks passed, 0 failed (fb-595.68.23)
</commit_message>
<xml_diff>
--- a/courts/ninth-circuit/montana/federal/district/complaint/usage/OUTPUT-complaint.docx
+++ b/courts/ninth-circuit/montana/federal/district/complaint/usage/OUTPUT-complaint.docx
@@ -705,7 +705,7 @@
           <w:p>
             <w:pPr>
               <w:spacing w:before="0" w:after="0" w:line="320" w:lineRule="exact"/>
-              <w:ind w:left="0" w:right="288" w:firstLine="0"/>
+              <w:ind w:left="0" w:right="273" w:firstLine="0"/>
               <w:jc w:val="left"/>
             </w:pPr>
             <w:r>
@@ -853,7 +853,7 @@
           <w:p>
             <w:pPr>
               <w:spacing w:before="320" w:after="0" w:line="320" w:lineRule="exact"/>
-              <w:ind w:left="2016" w:right="288" w:firstLine="0"/>
+              <w:ind w:left="2016" w:right="273" w:firstLine="0"/>
               <w:jc w:val="left"/>
             </w:pPr>
             <w:r>
@@ -863,7 +863,7 @@
           <w:p>
             <w:pPr>
               <w:spacing w:before="320" w:after="320" w:line="320" w:lineRule="exact"/>
-              <w:ind w:left="0" w:right="288" w:firstLine="0"/>
+              <w:ind w:left="0" w:right="273" w:firstLine="0"/>
               <w:jc w:val="left"/>
             </w:pPr>
             <w:r>
@@ -873,7 +873,7 @@
           <w:p>
             <w:pPr>
               <w:spacing w:before="0" w:after="0" w:line="320" w:lineRule="exact"/>
-              <w:ind w:left="0" w:right="288" w:firstLine="0"/>
+              <w:ind w:left="0" w:right="273" w:firstLine="0"/>
               <w:jc w:val="left"/>
             </w:pPr>
             <w:r>
@@ -967,7 +967,7 @@
           <w:p>
             <w:pPr>
               <w:spacing w:before="320" w:after="320" w:line="320" w:lineRule="exact"/>
-              <w:ind w:left="2016" w:right="288" w:firstLine="0"/>
+              <w:ind w:left="2016" w:right="273" w:firstLine="0"/>
               <w:jc w:val="left"/>
             </w:pPr>
             <w:r>

</xml_diff>